<commit_message>
update some word files
</commit_message>
<xml_diff>
--- a/src/assets/articles/SKETCHING DISSENT.docx
+++ b/src/assets/articles/SKETCHING DISSENT.docx
@@ -24,10 +24,7 @@
     </w:p>
     <w:p/>
     <w:p/>
-    <w:p>
-      <w:bookmarkStart w:id="0" w:name="_GoBack"/>
-      <w:bookmarkEnd w:id="0"/>
-    </w:p>
+    <w:p/>
     <w:p/>
     <w:p/>
     <w:p/>
@@ -135,7 +132,7 @@
           <w:szCs w:val="22"/>
         </w:rPr>
       </w:pPr>
-      <w:hyperlink r:id="rId5" w:history="1">
+      <w:hyperlink r:id="rId7" w:history="1">
         <w:r>
           <w:rPr>
             <w:rFonts w:ascii="Calibri" w:eastAsia="Calibri" w:hAnsi="Calibri" w:cs="Calibri"/>
@@ -194,7 +191,7 @@
           <w:szCs w:val="22"/>
         </w:rPr>
       </w:pPr>
-      <w:hyperlink r:id="rId6" w:history="1">
+      <w:hyperlink r:id="rId8" w:history="1">
         <w:r>
           <w:rPr>
             <w:rFonts w:ascii="Calibri" w:eastAsia="Calibri" w:hAnsi="Calibri" w:cs="Calibri"/>
@@ -262,7 +259,7 @@
           <w:szCs w:val="22"/>
         </w:rPr>
       </w:pPr>
-      <w:hyperlink r:id="rId7" w:history="1">
+      <w:hyperlink r:id="rId9" w:history="1">
         <w:r>
           <w:rPr>
             <w:rFonts w:ascii="Calibri" w:eastAsia="Calibri" w:hAnsi="Calibri" w:cs="Calibri"/>
@@ -6342,7 +6339,7 @@
         </w:rPr>
         <w:t xml:space="preserve">(4). </w:t>
       </w:r>
-      <w:hyperlink r:id="rId8" w:history="1">
+      <w:hyperlink r:id="rId10" w:history="1">
         <w:r>
           <w:rPr>
             <w:rFonts w:ascii="Calibri" w:eastAsia="Calibri" w:hAnsi="Calibri" w:cs="Calibri"/>
@@ -6460,7 +6457,7 @@
         </w:rPr>
         <w:t xml:space="preserve">, 1729–1744. </w:t>
       </w:r>
-      <w:hyperlink r:id="rId9" w:history="1">
+      <w:hyperlink r:id="rId11" w:history="1">
         <w:r>
           <w:rPr>
             <w:rFonts w:ascii="Calibri" w:eastAsia="Calibri" w:hAnsi="Calibri" w:cs="Calibri"/>
@@ -6524,7 +6521,7 @@
         </w:rPr>
         <w:t xml:space="preserve">(3), 487–519. </w:t>
       </w:r>
-      <w:hyperlink r:id="rId10" w:history="1">
+      <w:hyperlink r:id="rId12" w:history="1">
         <w:r>
           <w:rPr>
             <w:rFonts w:ascii="Calibri" w:eastAsia="Calibri" w:hAnsi="Calibri" w:cs="Calibri"/>
@@ -6710,7 +6707,7 @@
         </w:rPr>
         <w:t xml:space="preserve">(2), 1289–1301. </w:t>
       </w:r>
-      <w:hyperlink r:id="rId11" w:history="1">
+      <w:hyperlink r:id="rId13" w:history="1">
         <w:r>
           <w:rPr>
             <w:rFonts w:ascii="Calibri" w:eastAsia="Calibri" w:hAnsi="Calibri" w:cs="Calibri"/>
@@ -6883,7 +6880,7 @@
         </w:rPr>
         <w:t xml:space="preserve">(4), 347–355. </w:t>
       </w:r>
-      <w:hyperlink r:id="rId12" w:history="1">
+      <w:hyperlink r:id="rId14" w:history="1">
         <w:r>
           <w:rPr>
             <w:rFonts w:ascii="Calibri" w:eastAsia="Calibri" w:hAnsi="Calibri" w:cs="Calibri"/>
@@ -6988,7 +6985,7 @@
         </w:rPr>
         <w:t xml:space="preserve">(2), 218–244. </w:t>
       </w:r>
-      <w:hyperlink r:id="rId13" w:history="1">
+      <w:hyperlink r:id="rId15" w:history="1">
         <w:r>
           <w:rPr>
             <w:rFonts w:ascii="Calibri" w:eastAsia="Calibri" w:hAnsi="Calibri" w:cs="Calibri"/>
@@ -7052,7 +7049,7 @@
         </w:rPr>
         <w:t xml:space="preserve">, Article 172. </w:t>
       </w:r>
-      <w:hyperlink r:id="rId14" w:history="1">
+      <w:hyperlink r:id="rId16" w:history="1">
         <w:r>
           <w:rPr>
             <w:rFonts w:ascii="Calibri" w:eastAsia="Calibri" w:hAnsi="Calibri" w:cs="Calibri"/>
@@ -7154,12 +7151,175 @@
       </w:pPr>
     </w:p>
     <w:sectPr>
+      <w:headerReference w:type="even" r:id="rId17"/>
+      <w:headerReference w:type="default" r:id="rId18"/>
+      <w:footerReference w:type="even" r:id="rId19"/>
+      <w:footerReference w:type="default" r:id="rId20"/>
+      <w:headerReference w:type="first" r:id="rId21"/>
+      <w:footerReference w:type="first" r:id="rId22"/>
       <w:pgSz w:w="12240" w:h="15840"/>
       <w:pgMar w:top="1440" w:right="1800" w:bottom="1440" w:left="1800" w:header="720" w:footer="720" w:gutter="0"/>
       <w:cols w:space="720"/>
     </w:sectPr>
   </w:body>
 </w:document>
+</file>
+
+<file path=word/endnotes.xml><?xml version="1.0" encoding="utf-8"?>
+<w:endnotes xmlns:wpc="http://schemas.microsoft.com/office/word/2010/wordprocessingCanvas" xmlns:mc="http://schemas.openxmlformats.org/markup-compatibility/2006" xmlns:o="urn:schemas-microsoft-com:office:office" xmlns:r="http://schemas.openxmlformats.org/officeDocument/2006/relationships" xmlns:m="http://schemas.openxmlformats.org/officeDocument/2006/math" xmlns:v="urn:schemas-microsoft-com:vml" xmlns:wp14="http://schemas.microsoft.com/office/word/2010/wordprocessingDrawing" xmlns:wp="http://schemas.openxmlformats.org/drawingml/2006/wordprocessingDrawing" xmlns:w10="urn:schemas-microsoft-com:office:word" xmlns:w="http://schemas.openxmlformats.org/wordprocessingml/2006/main" xmlns:w14="http://schemas.microsoft.com/office/word/2010/wordml" xmlns:w15="http://schemas.microsoft.com/office/word/2012/wordml" xmlns:wpg="http://schemas.microsoft.com/office/word/2010/wordprocessingGroup" xmlns:wpi="http://schemas.microsoft.com/office/word/2010/wordprocessingInk" xmlns:wne="http://schemas.microsoft.com/office/word/2006/wordml" xmlns:wps="http://schemas.microsoft.com/office/word/2010/wordprocessingShape" mc:Ignorable="w14 w15 wp14">
+  <w:endnote w:type="separator" w:id="-1">
+    <w:p>
+      <w:r>
+        <w:separator/>
+      </w:r>
+    </w:p>
+  </w:endnote>
+  <w:endnote w:type="continuationSeparator" w:id="0">
+    <w:p>
+      <w:r>
+        <w:continuationSeparator/>
+      </w:r>
+    </w:p>
+  </w:endnote>
+</w:endnotes>
+</file>
+
+<file path=word/footer1.xml><?xml version="1.0" encoding="utf-8"?>
+<w:ftr xmlns:wpc="http://schemas.microsoft.com/office/word/2010/wordprocessingCanvas" xmlns:mc="http://schemas.openxmlformats.org/markup-compatibility/2006" xmlns:o="urn:schemas-microsoft-com:office:office" xmlns:r="http://schemas.openxmlformats.org/officeDocument/2006/relationships" xmlns:m="http://schemas.openxmlformats.org/officeDocument/2006/math" xmlns:v="urn:schemas-microsoft-com:vml" xmlns:wp14="http://schemas.microsoft.com/office/word/2010/wordprocessingDrawing" xmlns:wp="http://schemas.openxmlformats.org/drawingml/2006/wordprocessingDrawing" xmlns:w10="urn:schemas-microsoft-com:office:word" xmlns:w="http://schemas.openxmlformats.org/wordprocessingml/2006/main" xmlns:w14="http://schemas.microsoft.com/office/word/2010/wordml" xmlns:w15="http://schemas.microsoft.com/office/word/2012/wordml" xmlns:wpg="http://schemas.microsoft.com/office/word/2010/wordprocessingGroup" xmlns:wpi="http://schemas.microsoft.com/office/word/2010/wordprocessingInk" xmlns:wne="http://schemas.microsoft.com/office/word/2006/wordml" xmlns:wps="http://schemas.microsoft.com/office/word/2010/wordprocessingShape" mc:Ignorable="w14 w15 wp14">
+  <w:p>
+    <w:pPr>
+      <w:pStyle w:val="Footer"/>
+    </w:pPr>
+  </w:p>
+</w:ftr>
+</file>
+
+<file path=word/footer2.xml><?xml version="1.0" encoding="utf-8"?>
+<w:ftr xmlns:wpc="http://schemas.microsoft.com/office/word/2010/wordprocessingCanvas" xmlns:mc="http://schemas.openxmlformats.org/markup-compatibility/2006" xmlns:o="urn:schemas-microsoft-com:office:office" xmlns:r="http://schemas.openxmlformats.org/officeDocument/2006/relationships" xmlns:m="http://schemas.openxmlformats.org/officeDocument/2006/math" xmlns:v="urn:schemas-microsoft-com:vml" xmlns:wp14="http://schemas.microsoft.com/office/word/2010/wordprocessingDrawing" xmlns:wp="http://schemas.openxmlformats.org/drawingml/2006/wordprocessingDrawing" xmlns:w10="urn:schemas-microsoft-com:office:word" xmlns:w="http://schemas.openxmlformats.org/wordprocessingml/2006/main" xmlns:w14="http://schemas.microsoft.com/office/word/2010/wordml" xmlns:w15="http://schemas.microsoft.com/office/word/2012/wordml" xmlns:wpg="http://schemas.microsoft.com/office/word/2010/wordprocessingGroup" xmlns:wpi="http://schemas.microsoft.com/office/word/2010/wordprocessingInk" xmlns:wne="http://schemas.microsoft.com/office/word/2006/wordml" xmlns:wps="http://schemas.microsoft.com/office/word/2010/wordprocessingShape" mc:Ignorable="w14 w15 wp14">
+  <w:sdt>
+    <w:sdtPr>
+      <w:id w:val="-880708957"/>
+      <w:docPartObj>
+        <w:docPartGallery w:val="Page Numbers (Bottom of Page)"/>
+        <w:docPartUnique/>
+      </w:docPartObj>
+    </w:sdtPr>
+    <w:sdtEndPr>
+      <w:rPr>
+        <w:color w:val="7F7F7F" w:themeColor="background1" w:themeShade="7F"/>
+        <w:spacing w:val="60"/>
+      </w:rPr>
+    </w:sdtEndPr>
+    <w:sdtContent>
+      <w:bookmarkStart w:id="0" w:name="_GoBack" w:displacedByCustomXml="prev"/>
+      <w:bookmarkEnd w:id="0" w:displacedByCustomXml="prev"/>
+      <w:p>
+        <w:pPr>
+          <w:pStyle w:val="Footer"/>
+          <w:pBdr>
+            <w:top w:val="single" w:sz="4" w:space="1" w:color="D9D9D9" w:themeColor="background1" w:themeShade="D9"/>
+          </w:pBdr>
+          <w:jc w:val="right"/>
+        </w:pPr>
+        <w:r>
+          <w:fldChar w:fldCharType="begin"/>
+        </w:r>
+        <w:r>
+          <w:instrText xml:space="preserve"> PAGE   \* MERGEFORMAT </w:instrText>
+        </w:r>
+        <w:r>
+          <w:fldChar w:fldCharType="separate"/>
+        </w:r>
+        <w:r>
+          <w:rPr>
+            <w:noProof/>
+          </w:rPr>
+          <w:t>1</w:t>
+        </w:r>
+        <w:r>
+          <w:rPr>
+            <w:noProof/>
+          </w:rPr>
+          <w:fldChar w:fldCharType="end"/>
+        </w:r>
+        <w:r>
+          <w:t xml:space="preserve"> | </w:t>
+        </w:r>
+        <w:r>
+          <w:rPr>
+            <w:color w:val="7F7F7F" w:themeColor="background1" w:themeShade="7F"/>
+            <w:spacing w:val="60"/>
+          </w:rPr>
+          <w:t>Page</w:t>
+        </w:r>
+      </w:p>
+    </w:sdtContent>
+  </w:sdt>
+  <w:p>
+    <w:pPr>
+      <w:pStyle w:val="Footer"/>
+    </w:pPr>
+  </w:p>
+</w:ftr>
+</file>
+
+<file path=word/footer3.xml><?xml version="1.0" encoding="utf-8"?>
+<w:ftr xmlns:wpc="http://schemas.microsoft.com/office/word/2010/wordprocessingCanvas" xmlns:mc="http://schemas.openxmlformats.org/markup-compatibility/2006" xmlns:o="urn:schemas-microsoft-com:office:office" xmlns:r="http://schemas.openxmlformats.org/officeDocument/2006/relationships" xmlns:m="http://schemas.openxmlformats.org/officeDocument/2006/math" xmlns:v="urn:schemas-microsoft-com:vml" xmlns:wp14="http://schemas.microsoft.com/office/word/2010/wordprocessingDrawing" xmlns:wp="http://schemas.openxmlformats.org/drawingml/2006/wordprocessingDrawing" xmlns:w10="urn:schemas-microsoft-com:office:word" xmlns:w="http://schemas.openxmlformats.org/wordprocessingml/2006/main" xmlns:w14="http://schemas.microsoft.com/office/word/2010/wordml" xmlns:w15="http://schemas.microsoft.com/office/word/2012/wordml" xmlns:wpg="http://schemas.microsoft.com/office/word/2010/wordprocessingGroup" xmlns:wpi="http://schemas.microsoft.com/office/word/2010/wordprocessingInk" xmlns:wne="http://schemas.microsoft.com/office/word/2006/wordml" xmlns:wps="http://schemas.microsoft.com/office/word/2010/wordprocessingShape" mc:Ignorable="w14 w15 wp14">
+  <w:p>
+    <w:pPr>
+      <w:pStyle w:val="Footer"/>
+    </w:pPr>
+  </w:p>
+</w:ftr>
+</file>
+
+<file path=word/footnotes.xml><?xml version="1.0" encoding="utf-8"?>
+<w:footnotes xmlns:wpc="http://schemas.microsoft.com/office/word/2010/wordprocessingCanvas" xmlns:mc="http://schemas.openxmlformats.org/markup-compatibility/2006" xmlns:o="urn:schemas-microsoft-com:office:office" xmlns:r="http://schemas.openxmlformats.org/officeDocument/2006/relationships" xmlns:m="http://schemas.openxmlformats.org/officeDocument/2006/math" xmlns:v="urn:schemas-microsoft-com:vml" xmlns:wp14="http://schemas.microsoft.com/office/word/2010/wordprocessingDrawing" xmlns:wp="http://schemas.openxmlformats.org/drawingml/2006/wordprocessingDrawing" xmlns:w10="urn:schemas-microsoft-com:office:word" xmlns:w="http://schemas.openxmlformats.org/wordprocessingml/2006/main" xmlns:w14="http://schemas.microsoft.com/office/word/2010/wordml" xmlns:w15="http://schemas.microsoft.com/office/word/2012/wordml" xmlns:wpg="http://schemas.microsoft.com/office/word/2010/wordprocessingGroup" xmlns:wpi="http://schemas.microsoft.com/office/word/2010/wordprocessingInk" xmlns:wne="http://schemas.microsoft.com/office/word/2006/wordml" xmlns:wps="http://schemas.microsoft.com/office/word/2010/wordprocessingShape" mc:Ignorable="w14 w15 wp14">
+  <w:footnote w:type="separator" w:id="-1">
+    <w:p>
+      <w:r>
+        <w:separator/>
+      </w:r>
+    </w:p>
+  </w:footnote>
+  <w:footnote w:type="continuationSeparator" w:id="0">
+    <w:p>
+      <w:r>
+        <w:continuationSeparator/>
+      </w:r>
+    </w:p>
+  </w:footnote>
+</w:footnotes>
+</file>
+
+<file path=word/header1.xml><?xml version="1.0" encoding="utf-8"?>
+<w:hdr xmlns:wpc="http://schemas.microsoft.com/office/word/2010/wordprocessingCanvas" xmlns:mc="http://schemas.openxmlformats.org/markup-compatibility/2006" xmlns:o="urn:schemas-microsoft-com:office:office" xmlns:r="http://schemas.openxmlformats.org/officeDocument/2006/relationships" xmlns:m="http://schemas.openxmlformats.org/officeDocument/2006/math" xmlns:v="urn:schemas-microsoft-com:vml" xmlns:wp14="http://schemas.microsoft.com/office/word/2010/wordprocessingDrawing" xmlns:wp="http://schemas.openxmlformats.org/drawingml/2006/wordprocessingDrawing" xmlns:w10="urn:schemas-microsoft-com:office:word" xmlns:w="http://schemas.openxmlformats.org/wordprocessingml/2006/main" xmlns:w14="http://schemas.microsoft.com/office/word/2010/wordml" xmlns:w15="http://schemas.microsoft.com/office/word/2012/wordml" xmlns:wpg="http://schemas.microsoft.com/office/word/2010/wordprocessingGroup" xmlns:wpi="http://schemas.microsoft.com/office/word/2010/wordprocessingInk" xmlns:wne="http://schemas.microsoft.com/office/word/2006/wordml" xmlns:wps="http://schemas.microsoft.com/office/word/2010/wordprocessingShape" mc:Ignorable="w14 w15 wp14">
+  <w:p>
+    <w:pPr>
+      <w:pStyle w:val="Header"/>
+    </w:pPr>
+  </w:p>
+</w:hdr>
+</file>
+
+<file path=word/header2.xml><?xml version="1.0" encoding="utf-8"?>
+<w:hdr xmlns:wpc="http://schemas.microsoft.com/office/word/2010/wordprocessingCanvas" xmlns:mc="http://schemas.openxmlformats.org/markup-compatibility/2006" xmlns:o="urn:schemas-microsoft-com:office:office" xmlns:r="http://schemas.openxmlformats.org/officeDocument/2006/relationships" xmlns:m="http://schemas.openxmlformats.org/officeDocument/2006/math" xmlns:v="urn:schemas-microsoft-com:vml" xmlns:wp14="http://schemas.microsoft.com/office/word/2010/wordprocessingDrawing" xmlns:wp="http://schemas.openxmlformats.org/drawingml/2006/wordprocessingDrawing" xmlns:w10="urn:schemas-microsoft-com:office:word" xmlns:w="http://schemas.openxmlformats.org/wordprocessingml/2006/main" xmlns:w14="http://schemas.microsoft.com/office/word/2010/wordml" xmlns:w15="http://schemas.microsoft.com/office/word/2012/wordml" xmlns:wpg="http://schemas.microsoft.com/office/word/2010/wordprocessingGroup" xmlns:wpi="http://schemas.microsoft.com/office/word/2010/wordprocessingInk" xmlns:wne="http://schemas.microsoft.com/office/word/2006/wordml" xmlns:wps="http://schemas.microsoft.com/office/word/2010/wordprocessingShape" mc:Ignorable="w14 w15 wp14">
+  <w:p>
+    <w:pPr>
+      <w:pStyle w:val="Header"/>
+    </w:pPr>
+  </w:p>
+</w:hdr>
+</file>
+
+<file path=word/header3.xml><?xml version="1.0" encoding="utf-8"?>
+<w:hdr xmlns:wpc="http://schemas.microsoft.com/office/word/2010/wordprocessingCanvas" xmlns:mc="http://schemas.openxmlformats.org/markup-compatibility/2006" xmlns:o="urn:schemas-microsoft-com:office:office" xmlns:r="http://schemas.openxmlformats.org/officeDocument/2006/relationships" xmlns:m="http://schemas.openxmlformats.org/officeDocument/2006/math" xmlns:v="urn:schemas-microsoft-com:vml" xmlns:wp14="http://schemas.microsoft.com/office/word/2010/wordprocessingDrawing" xmlns:wp="http://schemas.openxmlformats.org/drawingml/2006/wordprocessingDrawing" xmlns:w10="urn:schemas-microsoft-com:office:word" xmlns:w="http://schemas.openxmlformats.org/wordprocessingml/2006/main" xmlns:w14="http://schemas.microsoft.com/office/word/2010/wordml" xmlns:w15="http://schemas.microsoft.com/office/word/2012/wordml" xmlns:wpg="http://schemas.microsoft.com/office/word/2010/wordprocessingGroup" xmlns:wpi="http://schemas.microsoft.com/office/word/2010/wordprocessingInk" xmlns:wne="http://schemas.microsoft.com/office/word/2006/wordml" xmlns:wps="http://schemas.microsoft.com/office/word/2010/wordprocessingShape" mc:Ignorable="w14 w15 wp14">
+  <w:p>
+    <w:pPr>
+      <w:pStyle w:val="Header"/>
+    </w:pPr>
+  </w:p>
+</w:hdr>
 </file>
 
 <file path=word/numbering.xml><?xml version="1.0" encoding="utf-8"?>
@@ -7900,6 +8060,56 @@
       <w:color w:val="1F3763"/>
     </w:rPr>
   </w:style>
+  <w:style w:type="paragraph" w:styleId="Header">
+    <w:name w:val="header"/>
+    <w:basedOn w:val="Normal"/>
+    <w:link w:val="HeaderChar"/>
+    <w:uiPriority w:val="99"/>
+    <w:unhideWhenUsed/>
+    <w:rsid w:val="0089645C"/>
+    <w:pPr>
+      <w:tabs>
+        <w:tab w:val="center" w:pos="4680"/>
+        <w:tab w:val="right" w:pos="9360"/>
+      </w:tabs>
+    </w:pPr>
+  </w:style>
+  <w:style w:type="character" w:customStyle="1" w:styleId="HeaderChar">
+    <w:name w:val="Header Char"/>
+    <w:basedOn w:val="DefaultParagraphFont"/>
+    <w:link w:val="Header"/>
+    <w:uiPriority w:val="99"/>
+    <w:rsid w:val="0089645C"/>
+    <w:rPr>
+      <w:sz w:val="24"/>
+      <w:szCs w:val="24"/>
+    </w:rPr>
+  </w:style>
+  <w:style w:type="paragraph" w:styleId="Footer">
+    <w:name w:val="footer"/>
+    <w:basedOn w:val="Normal"/>
+    <w:link w:val="FooterChar"/>
+    <w:uiPriority w:val="99"/>
+    <w:unhideWhenUsed/>
+    <w:rsid w:val="0089645C"/>
+    <w:pPr>
+      <w:tabs>
+        <w:tab w:val="center" w:pos="4680"/>
+        <w:tab w:val="right" w:pos="9360"/>
+      </w:tabs>
+    </w:pPr>
+  </w:style>
+  <w:style w:type="character" w:customStyle="1" w:styleId="FooterChar">
+    <w:name w:val="Footer Char"/>
+    <w:basedOn w:val="DefaultParagraphFont"/>
+    <w:link w:val="Footer"/>
+    <w:uiPriority w:val="99"/>
+    <w:rsid w:val="0089645C"/>
+    <w:rPr>
+      <w:sz w:val="24"/>
+      <w:szCs w:val="24"/>
+    </w:rPr>
+  </w:style>
 </w:styles>
 </file>
 

</xml_diff>